<commit_message>
Document CityLearn v3 adequations in thesis plan
</commit_message>
<xml_diff>
--- a/docs/PLAN_TESIS_MADRL_CITYLEARN_V3.docx
+++ b/docs/PLAN_TESIS_MADRL_CITYLEARN_V3.docx
@@ -1107,6 +1107,14 @@
     <w:p>
       <w:r>
         <w:br w:type="page"/>
+      </w:r>
+    </w:p>
+    <w:p>
+      <w:pPr>
+        <w:pStyle w:val="Heading1"/>
+      </w:pPr>
+      <w:r>
+        <w:t>II. CONTENIDOS</w:t>
       </w:r>
     </w:p>
     <w:p>
@@ -4837,6 +4845,1049 @@
                 <w:b w:val="0"/>
               </w:rPr>
               <w:t>Plan de tesis, anexos, matriz de consistencia y repositorio reproducible.</w:t>
+            </w:r>
+          </w:p>
+        </w:tc>
+      </w:tr>
+    </w:tbl>
+    <w:p/>
+    <w:p>
+      <w:pPr>
+        <w:pStyle w:val="Heading3"/>
+      </w:pPr>
+      <w:r>
+        <w:t>4.8.1 Registro de modificaciones, mejoras y adecuaciones CityLearn v2 -&gt; CityLearn v3</w:t>
+      </w:r>
+    </w:p>
+    <w:p>
+      <w:r>
+        <w:t>Este numeral documenta las intervenciones realizadas sobre el proyecto para dejar funcional el entrenamiento MADRL en CityLearn v3, manteniendo CityLearn v2 como base oficial de datos, simulación física, baseline y KPIs. La intención metodológica es que cada mejora sea auditada como parte de la solución y no como una reimplementación informal de los algoritmos.</w:t>
+      </w:r>
+    </w:p>
+    <w:p>
+      <w:r>
+        <w:t>La adecuación respeta el principio central del proyecto: CityLearn v3 es una capa experimental MADRL sobre CityLearn v2. Por tanto, los datasets, el `schema.json`, los espacios de acción y observación, los edificios, PV, baterías, EVs, precios, intensidad de carbono y evaluación `evaluate_v2` siguen siendo la fuente técnica de referencia.</w:t>
+      </w:r>
+    </w:p>
+    <w:tbl>
+      <w:tblPr>
+        <w:tblStyle w:val="TableGrid"/>
+        <w:tblW w:type="auto" w:w="0"/>
+        <w:jc w:val="center"/>
+        <w:tblLook w:firstColumn="1" w:firstRow="1" w:lastColumn="0" w:lastRow="0" w:noHBand="0" w:noVBand="1" w:val="04A0"/>
+      </w:tblPr>
+      <w:tblGrid>
+        <w:gridCol w:w="3041"/>
+        <w:gridCol w:w="3041"/>
+        <w:gridCol w:w="3041"/>
+      </w:tblGrid>
+      <w:tr>
+        <w:tc>
+          <w:tcPr>
+            <w:tcW w:type="dxa" w:w="3041"/>
+            <w:vAlign w:val="center"/>
+            <w:shd w:fill="D9EAF7"/>
+          </w:tcPr>
+          <w:p>
+            <w:pPr>
+              <w:jc w:val="left"/>
+            </w:pPr>
+            <w:r/>
+            <w:r>
+              <w:rPr>
+                <w:b/>
+              </w:rPr>
+              <w:t>Área intervenida</w:t>
+            </w:r>
+          </w:p>
+        </w:tc>
+        <w:tc>
+          <w:tcPr>
+            <w:tcW w:type="dxa" w:w="3041"/>
+            <w:vAlign w:val="center"/>
+            <w:shd w:fill="D9EAF7"/>
+          </w:tcPr>
+          <w:p>
+            <w:pPr>
+              <w:jc w:val="left"/>
+            </w:pPr>
+            <w:r/>
+            <w:r>
+              <w:rPr>
+                <w:b/>
+              </w:rPr>
+              <w:t>Adecuación implementada</w:t>
+            </w:r>
+          </w:p>
+        </w:tc>
+        <w:tc>
+          <w:tcPr>
+            <w:tcW w:type="dxa" w:w="3041"/>
+            <w:vAlign w:val="center"/>
+            <w:shd w:fill="D9EAF7"/>
+          </w:tcPr>
+          <w:p>
+            <w:pPr>
+              <w:jc w:val="left"/>
+            </w:pPr>
+            <w:r/>
+            <w:r>
+              <w:rPr>
+                <w:b/>
+              </w:rPr>
+              <w:t>Evidencia en el proyecto</w:t>
+            </w:r>
+          </w:p>
+        </w:tc>
+      </w:tr>
+      <w:tr>
+        <w:tc>
+          <w:tcPr>
+            <w:tcW w:type="dxa" w:w="3041"/>
+            <w:vAlign w:val="center"/>
+          </w:tcPr>
+          <w:p>
+            <w:pPr>
+              <w:jc w:val="left"/>
+            </w:pPr>
+            <w:r/>
+            <w:r>
+              <w:rPr>
+                <w:b w:val="0"/>
+              </w:rPr>
+              <w:t>Arquitectura v3</w:t>
+            </w:r>
+          </w:p>
+        </w:tc>
+        <w:tc>
+          <w:tcPr>
+            <w:tcW w:type="dxa" w:w="3041"/>
+            <w:vAlign w:val="center"/>
+          </w:tcPr>
+          <w:p>
+            <w:pPr>
+              <w:jc w:val="left"/>
+            </w:pPr>
+            <w:r/>
+            <w:r>
+              <w:rPr>
+                <w:b w:val="0"/>
+              </w:rPr>
+              <w:t>Creación de la capa `citylearn.v3` para configuración, entorno, objetivos, backends y adaptadores.</w:t>
+            </w:r>
+          </w:p>
+        </w:tc>
+        <w:tc>
+          <w:tcPr>
+            <w:tcW w:type="dxa" w:w="3041"/>
+            <w:vAlign w:val="center"/>
+          </w:tcPr>
+          <w:p>
+            <w:pPr>
+              <w:jc w:val="left"/>
+            </w:pPr>
+            <w:r/>
+            <w:r>
+              <w:rPr>
+                <w:b w:val="0"/>
+              </w:rPr>
+              <w:t>`CityLearn/citylearn/v3/config.py`, `environment.py`, `objectives.py`, `backends.py`.</w:t>
+            </w:r>
+          </w:p>
+        </w:tc>
+      </w:tr>
+      <w:tr>
+        <w:tc>
+          <w:tcPr>
+            <w:tcW w:type="dxa" w:w="3041"/>
+            <w:vAlign w:val="center"/>
+          </w:tcPr>
+          <w:p>
+            <w:pPr>
+              <w:jc w:val="left"/>
+            </w:pPr>
+            <w:r/>
+            <w:r>
+              <w:rPr>
+                <w:b w:val="0"/>
+              </w:rPr>
+              <w:t>Dec-POMDP</w:t>
+            </w:r>
+          </w:p>
+        </w:tc>
+        <w:tc>
+          <w:tcPr>
+            <w:tcW w:type="dxa" w:w="3041"/>
+            <w:vAlign w:val="center"/>
+          </w:tcPr>
+          <w:p>
+            <w:pPr>
+              <w:jc w:val="left"/>
+            </w:pPr>
+            <w:r/>
+            <w:r>
+              <w:rPr>
+                <w:b w:val="0"/>
+              </w:rPr>
+              <w:t>Cada edificio opera como agente descentralizado con observación local, acción local y recompensa colaborativa.</w:t>
+            </w:r>
+          </w:p>
+        </w:tc>
+        <w:tc>
+          <w:tcPr>
+            <w:tcW w:type="dxa" w:w="3041"/>
+            <w:vAlign w:val="center"/>
+          </w:tcPr>
+          <w:p>
+            <w:pPr>
+              <w:jc w:val="left"/>
+            </w:pPr>
+            <w:r/>
+            <w:r>
+              <w:rPr>
+                <w:b w:val="0"/>
+              </w:rPr>
+              <w:t>`build_citylearn_v3_env`, `build_default_17_building_ev_env`, `CityLearnV3MARLlibEnv`.</w:t>
+            </w:r>
+          </w:p>
+        </w:tc>
+      </w:tr>
+      <w:tr>
+        <w:tc>
+          <w:tcPr>
+            <w:tcW w:type="dxa" w:w="3041"/>
+            <w:vAlign w:val="center"/>
+          </w:tcPr>
+          <w:p>
+            <w:pPr>
+              <w:jc w:val="left"/>
+            </w:pPr>
+            <w:r/>
+            <w:r>
+              <w:rPr>
+                <w:b w:val="0"/>
+              </w:rPr>
+              <w:t>CTDE</w:t>
+            </w:r>
+          </w:p>
+        </w:tc>
+        <w:tc>
+          <w:tcPr>
+            <w:tcW w:type="dxa" w:w="3041"/>
+            <w:vAlign w:val="center"/>
+          </w:tcPr>
+          <w:p>
+            <w:pPr>
+              <w:jc w:val="left"/>
+            </w:pPr>
+            <w:r/>
+            <w:r>
+              <w:rPr>
+                <w:b w:val="0"/>
+              </w:rPr>
+              <w:t>Exposición de estado global para entrenamiento centralizado y ejecución con políticas locales por edificio.</w:t>
+            </w:r>
+          </w:p>
+        </w:tc>
+        <w:tc>
+          <w:tcPr>
+            <w:tcW w:type="dxa" w:w="3041"/>
+            <w:vAlign w:val="center"/>
+          </w:tcPr>
+          <w:p>
+            <w:pPr>
+              <w:jc w:val="left"/>
+            </w:pPr>
+            <w:r/>
+            <w:r>
+              <w:rPr>
+                <w:b w:val="0"/>
+              </w:rPr>
+              <w:t>Uso de `state()`, `state_space`, `share_observation_space` y adaptadores por backend.</w:t>
+            </w:r>
+          </w:p>
+        </w:tc>
+      </w:tr>
+      <w:tr>
+        <w:tc>
+          <w:tcPr>
+            <w:tcW w:type="dxa" w:w="3041"/>
+            <w:vAlign w:val="center"/>
+          </w:tcPr>
+          <w:p>
+            <w:pPr>
+              <w:jc w:val="left"/>
+            </w:pPr>
+            <w:r/>
+            <w:r>
+              <w:rPr>
+                <w:b w:val="0"/>
+              </w:rPr>
+              <w:t>Dataset de tesis</w:t>
+            </w:r>
+          </w:p>
+        </w:tc>
+        <w:tc>
+          <w:tcPr>
+            <w:tcW w:type="dxa" w:w="3041"/>
+            <w:vAlign w:val="center"/>
+          </w:tcPr>
+          <w:p>
+            <w:pPr>
+              <w:jc w:val="left"/>
+            </w:pPr>
+            <w:r/>
+            <w:r>
+              <w:rPr>
+                <w:b w:val="0"/>
+              </w:rPr>
+              <w:t>Definición del dataset por defecto con 17 edificios, EVs, 8760 pasos horarios y soporte para otros schemas CityLearn v2.</w:t>
+            </w:r>
+          </w:p>
+        </w:tc>
+        <w:tc>
+          <w:tcPr>
+            <w:tcW w:type="dxa" w:w="3041"/>
+            <w:vAlign w:val="center"/>
+          </w:tcPr>
+          <w:p>
+            <w:pPr>
+              <w:jc w:val="left"/>
+            </w:pPr>
+            <w:r/>
+            <w:r>
+              <w:rPr>
+                <w:b w:val="0"/>
+              </w:rPr>
+              <w:t>`citylearn_challenge_2022_phase_all_plus_evs/schema.json`.</w:t>
+            </w:r>
+          </w:p>
+        </w:tc>
+      </w:tr>
+      <w:tr>
+        <w:tc>
+          <w:tcPr>
+            <w:tcW w:type="dxa" w:w="3041"/>
+            <w:vAlign w:val="center"/>
+          </w:tcPr>
+          <w:p>
+            <w:pPr>
+              <w:jc w:val="left"/>
+            </w:pPr>
+            <w:r/>
+            <w:r>
+              <w:rPr>
+                <w:b w:val="0"/>
+              </w:rPr>
+              <w:t>Backends oficiales</w:t>
+            </w:r>
+          </w:p>
+        </w:tc>
+        <w:tc>
+          <w:tcPr>
+            <w:tcW w:type="dxa" w:w="3041"/>
+            <w:vAlign w:val="center"/>
+          </w:tcPr>
+          <w:p>
+            <w:pPr>
+              <w:jc w:val="left"/>
+            </w:pPr>
+            <w:r/>
+            <w:r>
+              <w:rPr>
+                <w:b w:val="0"/>
+              </w:rPr>
+              <w:t>Registro de HAPPO, MASAC/mSAC, MATD3, MATD3 PyTorch, MAAC y MARLlib, evitando duplicar implementaciones MADRL dentro de `citylearn.agents`.</w:t>
+            </w:r>
+          </w:p>
+        </w:tc>
+        <w:tc>
+          <w:tcPr>
+            <w:tcW w:type="dxa" w:w="3041"/>
+            <w:vAlign w:val="center"/>
+          </w:tcPr>
+          <w:p>
+            <w:pPr>
+              <w:jc w:val="left"/>
+            </w:pPr>
+            <w:r/>
+            <w:r>
+              <w:rPr>
+                <w:b w:val="0"/>
+              </w:rPr>
+              <w:t>`CityLearn/citylearn/official_madrl.py` y `external/backends.lock.json`.</w:t>
+            </w:r>
+          </w:p>
+        </w:tc>
+      </w:tr>
+      <w:tr>
+        <w:tc>
+          <w:tcPr>
+            <w:tcW w:type="dxa" w:w="3041"/>
+            <w:vAlign w:val="center"/>
+          </w:tcPr>
+          <w:p>
+            <w:pPr>
+              <w:jc w:val="left"/>
+            </w:pPr>
+            <w:r/>
+            <w:r>
+              <w:rPr>
+                <w:b w:val="0"/>
+              </w:rPr>
+              <w:t>Scripts de entrenamiento</w:t>
+            </w:r>
+          </w:p>
+        </w:tc>
+        <w:tc>
+          <w:tcPr>
+            <w:tcW w:type="dxa" w:w="3041"/>
+            <w:vAlign w:val="center"/>
+          </w:tcPr>
+          <w:p>
+            <w:pPr>
+              <w:jc w:val="left"/>
+            </w:pPr>
+            <w:r/>
+            <w:r>
+              <w:rPr>
+                <w:b w:val="0"/>
+              </w:rPr>
+              <w:t>Creación de scripts independientes para cada MADRL con parámetros, CUDA, semillas, escenario, episodios y salida reproducible.</w:t>
+            </w:r>
+          </w:p>
+        </w:tc>
+        <w:tc>
+          <w:tcPr>
+            <w:tcW w:type="dxa" w:w="3041"/>
+            <w:vAlign w:val="center"/>
+          </w:tcPr>
+          <w:p>
+            <w:pPr>
+              <w:jc w:val="left"/>
+            </w:pPr>
+            <w:r/>
+            <w:r>
+              <w:rPr>
+                <w:b w:val="0"/>
+              </w:rPr>
+              <w:t>`train_citylearn_v3_happo.py`, `train_citylearn_v3_masac.py`, `train_citylearn_v3_matd3.py`, `train_citylearn_v3_maac.py`.</w:t>
+            </w:r>
+          </w:p>
+        </w:tc>
+      </w:tr>
+      <w:tr>
+        <w:tc>
+          <w:tcPr>
+            <w:tcW w:type="dxa" w:w="3041"/>
+            <w:vAlign w:val="center"/>
+          </w:tcPr>
+          <w:p>
+            <w:pPr>
+              <w:jc w:val="left"/>
+            </w:pPr>
+            <w:r/>
+            <w:r>
+              <w:rPr>
+                <w:b w:val="0"/>
+              </w:rPr>
+              <w:t>Lanzamiento oficial</w:t>
+            </w:r>
+          </w:p>
+        </w:tc>
+        <w:tc>
+          <w:tcPr>
+            <w:tcW w:type="dxa" w:w="3041"/>
+            <w:vAlign w:val="center"/>
+          </w:tcPr>
+          <w:p>
+            <w:pPr>
+              <w:jc w:val="left"/>
+            </w:pPr>
+            <w:r/>
+            <w:r>
+              <w:rPr>
+                <w:b w:val="0"/>
+              </w:rPr>
+              <w:t>Automatización secuencial de entrenamiento oficial para reducir conflictos de memoria GPU y registrar estado global.</w:t>
+            </w:r>
+          </w:p>
+        </w:tc>
+        <w:tc>
+          <w:tcPr>
+            <w:tcW w:type="dxa" w:w="3041"/>
+            <w:vAlign w:val="center"/>
+          </w:tcPr>
+          <w:p>
+            <w:pPr>
+              <w:jc w:val="left"/>
+            </w:pPr>
+            <w:r/>
+            <w:r>
+              <w:rPr>
+                <w:b w:val="0"/>
+              </w:rPr>
+              <w:t>`launch_citylearn_v3_official_training.ps1`, `official_full_status.json`, `official_full_manifest.json`.</w:t>
+            </w:r>
+          </w:p>
+        </w:tc>
+      </w:tr>
+      <w:tr>
+        <w:tc>
+          <w:tcPr>
+            <w:tcW w:type="dxa" w:w="3041"/>
+            <w:vAlign w:val="center"/>
+          </w:tcPr>
+          <w:p>
+            <w:pPr>
+              <w:jc w:val="left"/>
+            </w:pPr>
+            <w:r/>
+            <w:r>
+              <w:rPr>
+                <w:b w:val="0"/>
+              </w:rPr>
+              <w:t>CUDA y Python 3.9</w:t>
+            </w:r>
+          </w:p>
+        </w:tc>
+        <w:tc>
+          <w:tcPr>
+            <w:tcW w:type="dxa" w:w="3041"/>
+            <w:vAlign w:val="center"/>
+          </w:tcPr>
+          <w:p>
+            <w:pPr>
+              <w:jc w:val="left"/>
+            </w:pPr>
+            <w:r/>
+            <w:r>
+              <w:rPr>
+                <w:b w:val="0"/>
+              </w:rPr>
+              <w:t>Preparación del entorno `.venv39-citylearn-v3` con PyTorch CUDA para entrenamiento acelerado.</w:t>
+            </w:r>
+          </w:p>
+        </w:tc>
+        <w:tc>
+          <w:tcPr>
+            <w:tcW w:type="dxa" w:w="3041"/>
+            <w:vAlign w:val="center"/>
+          </w:tcPr>
+          <w:p>
+            <w:pPr>
+              <w:jc w:val="left"/>
+            </w:pPr>
+            <w:r/>
+            <w:r>
+              <w:rPr>
+                <w:b w:val="0"/>
+              </w:rPr>
+              <w:t>Estado reportado: `torch 2.8.0+cu126`, `cuda=true`.</w:t>
+            </w:r>
+          </w:p>
+        </w:tc>
+      </w:tr>
+      <w:tr>
+        <w:tc>
+          <w:tcPr>
+            <w:tcW w:type="dxa" w:w="3041"/>
+            <w:vAlign w:val="center"/>
+          </w:tcPr>
+          <w:p>
+            <w:pPr>
+              <w:jc w:val="left"/>
+            </w:pPr>
+            <w:r/>
+            <w:r>
+              <w:rPr>
+                <w:b w:val="0"/>
+              </w:rPr>
+              <w:t>MATD3 funcional</w:t>
+            </w:r>
+          </w:p>
+        </w:tc>
+        <w:tc>
+          <w:tcPr>
+            <w:tcW w:type="dxa" w:w="3041"/>
+            <w:vAlign w:val="center"/>
+          </w:tcPr>
+          <w:p>
+            <w:pPr>
+              <w:jc w:val="left"/>
+            </w:pPr>
+            <w:r/>
+            <w:r>
+              <w:rPr>
+                <w:b w:val="0"/>
+              </w:rPr>
+              <w:t>Ajustes para backend PyTorch compatible con Python 3.9, manejo correcto de dispositivo/dtype y módulos del crítico.</w:t>
+            </w:r>
+          </w:p>
+        </w:tc>
+        <w:tc>
+          <w:tcPr>
+            <w:tcW w:type="dxa" w:w="3041"/>
+            <w:vAlign w:val="center"/>
+          </w:tcPr>
+          <w:p>
+            <w:pPr>
+              <w:jc w:val="left"/>
+            </w:pPr>
+            <w:r/>
+            <w:r>
+              <w:rPr>
+                <w:b w:val="0"/>
+              </w:rPr>
+              <w:t>`external/off-policy` como backend PyTorch source-backed; MATD3 original queda como referencia del paper.</w:t>
+            </w:r>
+          </w:p>
+        </w:tc>
+      </w:tr>
+      <w:tr>
+        <w:tc>
+          <w:tcPr>
+            <w:tcW w:type="dxa" w:w="3041"/>
+            <w:vAlign w:val="center"/>
+          </w:tcPr>
+          <w:p>
+            <w:pPr>
+              <w:jc w:val="left"/>
+            </w:pPr>
+            <w:r/>
+            <w:r>
+              <w:rPr>
+                <w:b w:val="0"/>
+              </w:rPr>
+              <w:t>Objetivos científicos</w:t>
+            </w:r>
+          </w:p>
+        </w:tc>
+        <w:tc>
+          <w:tcPr>
+            <w:tcW w:type="dxa" w:w="3041"/>
+            <w:vAlign w:val="center"/>
+          </w:tcPr>
+          <w:p>
+            <w:pPr>
+              <w:jc w:val="left"/>
+            </w:pPr>
+            <w:r/>
+            <w:r>
+              <w:rPr>
+                <w:b w:val="0"/>
+              </w:rPr>
+              <w:t>Reformulación del proyecto en tres ejes: OE1 flexibilidad, OE2 emisiones de CO2 y OE3 costos energéticos.</w:t>
+            </w:r>
+          </w:p>
+        </w:tc>
+        <w:tc>
+          <w:tcPr>
+            <w:tcW w:type="dxa" w:w="3041"/>
+            <w:vAlign w:val="center"/>
+          </w:tcPr>
+          <w:p>
+            <w:pPr>
+              <w:jc w:val="left"/>
+            </w:pPr>
+            <w:r/>
+            <w:r>
+              <w:rPr>
+                <w:b w:val="0"/>
+              </w:rPr>
+              <w:t>`CityLearn/citylearn/v3/objectives.py` y `ESTRATEGIA_3PILARES_MADRL.md`.</w:t>
+            </w:r>
+          </w:p>
+        </w:tc>
+      </w:tr>
+      <w:tr>
+        <w:tc>
+          <w:tcPr>
+            <w:tcW w:type="dxa" w:w="3041"/>
+            <w:vAlign w:val="center"/>
+          </w:tcPr>
+          <w:p>
+            <w:pPr>
+              <w:jc w:val="left"/>
+            </w:pPr>
+            <w:r/>
+            <w:r>
+              <w:rPr>
+                <w:b w:val="0"/>
+              </w:rPr>
+              <w:t>KPIs por eje</w:t>
+            </w:r>
+          </w:p>
+        </w:tc>
+        <w:tc>
+          <w:tcPr>
+            <w:tcW w:type="dxa" w:w="3041"/>
+            <w:vAlign w:val="center"/>
+          </w:tcPr>
+          <w:p>
+            <w:pPr>
+              <w:jc w:val="left"/>
+            </w:pPr>
+            <w:r/>
+            <w:r>
+              <w:rPr>
+                <w:b w:val="0"/>
+              </w:rPr>
+              <w:t>Exposición de 36 KPIs para OE1, 7 para OE2 y 11 para OE3, con fuente, dirección de mejora y relación con baseline.</w:t>
+            </w:r>
+          </w:p>
+        </w:tc>
+        <w:tc>
+          <w:tcPr>
+            <w:tcW w:type="dxa" w:w="3041"/>
+            <w:vAlign w:val="center"/>
+          </w:tcPr>
+          <w:p>
+            <w:pPr>
+              <w:jc w:val="left"/>
+            </w:pPr>
+            <w:r/>
+            <w:r>
+              <w:rPr>
+                <w:b w:val="0"/>
+              </w:rPr>
+              <w:t>`objective_manifest()`, `objective_kpis.csv`, notebook MADRL CityLearn v3.</w:t>
+            </w:r>
+          </w:p>
+        </w:tc>
+      </w:tr>
+      <w:tr>
+        <w:tc>
+          <w:tcPr>
+            <w:tcW w:type="dxa" w:w="3041"/>
+            <w:vAlign w:val="center"/>
+          </w:tcPr>
+          <w:p>
+            <w:pPr>
+              <w:jc w:val="left"/>
+            </w:pPr>
+            <w:r/>
+            <w:r>
+              <w:rPr>
+                <w:b w:val="0"/>
+              </w:rPr>
+              <w:t>KPI derivado</w:t>
+            </w:r>
+          </w:p>
+        </w:tc>
+        <w:tc>
+          <w:tcPr>
+            <w:tcW w:type="dxa" w:w="3041"/>
+            <w:vAlign w:val="center"/>
+          </w:tcPr>
+          <w:p>
+            <w:pPr>
+              <w:jc w:val="left"/>
+            </w:pPr>
+            <w:r/>
+            <w:r>
+              <w:rPr>
+                <w:b w:val="0"/>
+              </w:rPr>
+              <w:t>Inclusión de `price_signal_deviation` como KPI derivado desde importación neta distrital y tarifa dinámica.</w:t>
+            </w:r>
+          </w:p>
+        </w:tc>
+        <w:tc>
+          <w:tcPr>
+            <w:tcW w:type="dxa" w:w="3041"/>
+            <w:vAlign w:val="center"/>
+          </w:tcPr>
+          <w:p>
+            <w:pPr>
+              <w:jc w:val="left"/>
+            </w:pPr>
+            <w:r/>
+            <w:r>
+              <w:rPr>
+                <w:b w:val="0"/>
+              </w:rPr>
+              <w:t>`price_signal_deviation()` en `CityLearn/citylearn/v3/objectives.py`.</w:t>
+            </w:r>
+          </w:p>
+        </w:tc>
+      </w:tr>
+      <w:tr>
+        <w:tc>
+          <w:tcPr>
+            <w:tcW w:type="dxa" w:w="3041"/>
+            <w:vAlign w:val="center"/>
+          </w:tcPr>
+          <w:p>
+            <w:pPr>
+              <w:jc w:val="left"/>
+            </w:pPr>
+            <w:r/>
+            <w:r>
+              <w:rPr>
+                <w:b w:val="0"/>
+              </w:rPr>
+              <w:t>Artefactos reproducibles</w:t>
+            </w:r>
+          </w:p>
+        </w:tc>
+        <w:tc>
+          <w:tcPr>
+            <w:tcW w:type="dxa" w:w="3041"/>
+            <w:vAlign w:val="center"/>
+          </w:tcPr>
+          <w:p>
+            <w:pPr>
+              <w:jc w:val="left"/>
+            </w:pPr>
+            <w:r/>
+            <w:r>
+              <w:rPr>
+                <w:b w:val="0"/>
+              </w:rPr>
+              <w:t>Estandarización de carpetas por algoritmo con resultados, series, trazas, checkpoints, figuras y tablas.</w:t>
+            </w:r>
+          </w:p>
+        </w:tc>
+        <w:tc>
+          <w:tcPr>
+            <w:tcW w:type="dxa" w:w="3041"/>
+            <w:vAlign w:val="center"/>
+          </w:tcPr>
+          <w:p>
+            <w:pPr>
+              <w:jc w:val="left"/>
+            </w:pPr>
+            <w:r/>
+            <w:r>
+              <w:rPr>
+                <w:b w:val="0"/>
+              </w:rPr>
+              <w:t>`data/results.json`, `data/timeseries.csv`, `data/trace.csv`, `data/checkpoint_manifest.json`, `checkpoints/`, `figures/`.</w:t>
+            </w:r>
+          </w:p>
+        </w:tc>
+      </w:tr>
+      <w:tr>
+        <w:tc>
+          <w:tcPr>
+            <w:tcW w:type="dxa" w:w="3041"/>
+            <w:vAlign w:val="center"/>
+          </w:tcPr>
+          <w:p>
+            <w:pPr>
+              <w:jc w:val="left"/>
+            </w:pPr>
+            <w:r/>
+            <w:r>
+              <w:rPr>
+                <w:b w:val="0"/>
+              </w:rPr>
+              <w:t>Figuras y cuadros</w:t>
+            </w:r>
+          </w:p>
+        </w:tc>
+        <w:tc>
+          <w:tcPr>
+            <w:tcW w:type="dxa" w:w="3041"/>
+            <w:vAlign w:val="center"/>
+          </w:tcPr>
+          <w:p>
+            <w:pPr>
+              <w:jc w:val="left"/>
+            </w:pPr>
+            <w:r/>
+            <w:r>
+              <w:rPr>
+                <w:b w:val="0"/>
+              </w:rPr>
+              <w:t>Generación de recompensas, convergencia, returns, eficiencia, comparación baseline, perfiles por eje y tablas CSV/Markdown.</w:t>
+            </w:r>
+          </w:p>
+        </w:tc>
+        <w:tc>
+          <w:tcPr>
+            <w:tcW w:type="dxa" w:w="3041"/>
+            <w:vAlign w:val="center"/>
+          </w:tcPr>
+          <w:p>
+            <w:pPr>
+              <w:jc w:val="left"/>
+            </w:pPr>
+            <w:r/>
+            <w:r>
+              <w:rPr>
+                <w:b w:val="0"/>
+              </w:rPr>
+              <w:t>`regenerate_citylearn_v3_figures.py` y `figures/figures_manifest.json`.</w:t>
+            </w:r>
+          </w:p>
+        </w:tc>
+      </w:tr>
+      <w:tr>
+        <w:tc>
+          <w:tcPr>
+            <w:tcW w:type="dxa" w:w="3041"/>
+            <w:vAlign w:val="center"/>
+          </w:tcPr>
+          <w:p>
+            <w:pPr>
+              <w:jc w:val="left"/>
+            </w:pPr>
+            <w:r/>
+            <w:r>
+              <w:rPr>
+                <w:b w:val="0"/>
+              </w:rPr>
+              <w:t>Tutorial académico</w:t>
+            </w:r>
+          </w:p>
+        </w:tc>
+        <w:tc>
+          <w:tcPr>
+            <w:tcW w:type="dxa" w:w="3041"/>
+            <w:vAlign w:val="center"/>
+          </w:tcPr>
+          <w:p>
+            <w:pPr>
+              <w:jc w:val="left"/>
+            </w:pPr>
+            <w:r/>
+            <w:r>
+              <w:rPr>
+                <w:b w:val="0"/>
+              </w:rPr>
+              <w:t>Creación de notebook CityLearn v3 MADRL con diagnóstico, problemática, marco teórico, backends, papers, GitHub y KPIs.</w:t>
+            </w:r>
+          </w:p>
+        </w:tc>
+        <w:tc>
+          <w:tcPr>
+            <w:tcW w:type="dxa" w:w="3041"/>
+            <w:vAlign w:val="center"/>
+          </w:tcPr>
+          <w:p>
+            <w:pPr>
+              <w:jc w:val="left"/>
+            </w:pPr>
+            <w:r/>
+            <w:r>
+              <w:rPr>
+                <w:b w:val="0"/>
+              </w:rPr>
+              <w:t>`CityLearn/examples/madrl_citylearn_v3_tutorial.ipynb`.</w:t>
+            </w:r>
+          </w:p>
+        </w:tc>
+      </w:tr>
+      <w:tr>
+        <w:tc>
+          <w:tcPr>
+            <w:tcW w:type="dxa" w:w="3041"/>
+            <w:vAlign w:val="center"/>
+          </w:tcPr>
+          <w:p>
+            <w:pPr>
+              <w:jc w:val="left"/>
+            </w:pPr>
+            <w:r/>
+            <w:r>
+              <w:rPr>
+                <w:b w:val="0"/>
+              </w:rPr>
+              <w:t>Validaciones</w:t>
+            </w:r>
+          </w:p>
+        </w:tc>
+        <w:tc>
+          <w:tcPr>
+            <w:tcW w:type="dxa" w:w="3041"/>
+            <w:vAlign w:val="center"/>
+          </w:tcPr>
+          <w:p>
+            <w:pPr>
+              <w:jc w:val="left"/>
+            </w:pPr>
+            <w:r/>
+            <w:r>
+              <w:rPr>
+                <w:b w:val="0"/>
+              </w:rPr>
+              <w:t>Pruebas de construcción del entorno, KPIs, imports de backends, smoke tests y entrenamiento de 5 episodios.</w:t>
+            </w:r>
+          </w:p>
+        </w:tc>
+        <w:tc>
+          <w:tcPr>
+            <w:tcW w:type="dxa" w:w="3041"/>
+            <w:vAlign w:val="center"/>
+          </w:tcPr>
+          <w:p>
+            <w:pPr>
+              <w:jc w:val="left"/>
+            </w:pPr>
+            <w:r/>
+            <w:r>
+              <w:rPr>
+                <w:b w:val="0"/>
+              </w:rPr>
+              <w:t>`validate_citylearn_v3_objectives.py`, logs smoke y salidas en `outputs/`.</w:t>
+            </w:r>
+          </w:p>
+        </w:tc>
+      </w:tr>
+      <w:tr>
+        <w:tc>
+          <w:tcPr>
+            <w:tcW w:type="dxa" w:w="3041"/>
+            <w:vAlign w:val="center"/>
+          </w:tcPr>
+          <w:p>
+            <w:pPr>
+              <w:jc w:val="left"/>
+            </w:pPr>
+            <w:r/>
+            <w:r>
+              <w:rPr>
+                <w:b w:val="0"/>
+              </w:rPr>
+              <w:t>Repositorio público</w:t>
+            </w:r>
+          </w:p>
+        </w:tc>
+        <w:tc>
+          <w:tcPr>
+            <w:tcW w:type="dxa" w:w="3041"/>
+            <w:vAlign w:val="center"/>
+          </w:tcPr>
+          <w:p>
+            <w:pPr>
+              <w:jc w:val="left"/>
+            </w:pPr>
+            <w:r/>
+            <w:r>
+              <w:rPr>
+                <w:b w:val="0"/>
+              </w:rPr>
+              <w:t>Versionamiento del proyecto raíz y fork CityLearn con commits trazables para reproducibilidad.</w:t>
+            </w:r>
+          </w:p>
+        </w:tc>
+        <w:tc>
+          <w:tcPr>
+            <w:tcW w:type="dxa" w:w="3041"/>
+            <w:vAlign w:val="center"/>
+          </w:tcPr>
+          <w:p>
+            <w:pPr>
+              <w:jc w:val="left"/>
+            </w:pPr>
+            <w:r/>
+            <w:r>
+              <w:rPr>
+                <w:b w:val="0"/>
+              </w:rPr>
+              <w:t>`Mac-Tapia/MADRLCitytleranflexresdr` y `Mac-Tapia/CityLearn`.</w:t>
             </w:r>
           </w:p>
         </w:tc>

</xml_diff>